<commit_message>
Actualizacion y Correccion  de Errores
</commit_message>
<xml_diff>
--- a/parte_c_performance/ejercicio2_analisis_resultados/InformeResultados.docx
+++ b/parte_c_performance/ejercicio2_analisis_resultados/InformeResultados.docx
@@ -204,6 +204,7 @@
           </w:tcPr>
           <w:p>
             <w:pPr>
+              <w:ind w:left="720" w:hanging="720"/>
               <w:rPr>
                 <w:lang w:val="es-EC"/>
               </w:rPr>
@@ -227,7 +228,21 @@
                 <w:sz w:val="20"/>
                 <w:lang w:val="es-EC"/>
               </w:rPr>
-              <w:t xml:space="preserve"> (Analista de Automatización / QE)</w:t>
+              <w:t xml:space="preserve"> (Analista de Automatización / Q</w:t>
+            </w:r>
+            <w:r>
+              <w:rPr>
+                <w:sz w:val="20"/>
+                <w:lang w:val="es-EC"/>
+              </w:rPr>
+              <w:t>A</w:t>
+            </w:r>
+            <w:r>
+              <w:rPr>
+                <w:sz w:val="20"/>
+                <w:lang w:val="es-EC"/>
+              </w:rPr>
+              <w:t>)</w:t>
             </w:r>
           </w:p>
         </w:tc>
@@ -3943,7 +3958,21 @@
               <w:rPr>
                 <w:sz w:val="17"/>
               </w:rPr>
-              <w:t>Media (Mediano Plazo)</w:t>
+              <w:t xml:space="preserve">Media (Mediano </w:t>
+            </w:r>
+            <w:proofErr w:type="spellStart"/>
+            <w:r>
+              <w:rPr>
+                <w:sz w:val="17"/>
+              </w:rPr>
+              <w:t>Plazo</w:t>
+            </w:r>
+            <w:proofErr w:type="spellEnd"/>
+            <w:r>
+              <w:rPr>
+                <w:sz w:val="17"/>
+              </w:rPr>
+              <w:t>)</w:t>
             </w:r>
           </w:p>
         </w:tc>
@@ -4020,7 +4049,21 @@
               <w:rPr>
                 <w:sz w:val="17"/>
               </w:rPr>
-              <w:t>Media (Mediano Plazo)</w:t>
+              <w:t xml:space="preserve">Media (Mediano </w:t>
+            </w:r>
+            <w:proofErr w:type="spellStart"/>
+            <w:r>
+              <w:rPr>
+                <w:sz w:val="17"/>
+              </w:rPr>
+              <w:t>Plazo</w:t>
+            </w:r>
+            <w:proofErr w:type="spellEnd"/>
+            <w:r>
+              <w:rPr>
+                <w:sz w:val="17"/>
+              </w:rPr>
+              <w:t>)</w:t>
             </w:r>
           </w:p>
         </w:tc>
@@ -4097,7 +4140,21 @@
               <w:rPr>
                 <w:sz w:val="17"/>
               </w:rPr>
-              <w:t>Baja (Resiliencia)</w:t>
+              <w:t>Baja (</w:t>
+            </w:r>
+            <w:proofErr w:type="spellStart"/>
+            <w:r>
+              <w:rPr>
+                <w:sz w:val="17"/>
+              </w:rPr>
+              <w:t>Resiliencia</w:t>
+            </w:r>
+            <w:proofErr w:type="spellEnd"/>
+            <w:r>
+              <w:rPr>
+                <w:sz w:val="17"/>
+              </w:rPr>
+              <w:t>)</w:t>
             </w:r>
           </w:p>
         </w:tc>

</xml_diff>